<commit_message>
Fix: Add missing content to all 24 lesson plans
</commit_message>
<xml_diff>
--- a/lesson-plans/lessonplan_pertemuan01.docx
+++ b/lesson-plans/lessonplan_pertemuan01.docx
@@ -583,7 +583,7 @@
           </w:tcPr>
           <w:p>
             <w:r>
-              <w:t>Memahami peran desainer, analisis brief, dan prosedur K3 TIK.</w:t>
+              <w:t>Memahami peran desainer, analisis brief, dan prosedur K3 TIK secara disiplin.</w:t>
             </w:r>
           </w:p>
         </w:tc>
@@ -1049,20 +1049,14 @@
             <w:vMerge w:val="restart"/>
           </w:tcPr>
           <w:p>
-            <w:pPr>
-              <w:rPr>
-                <w:rFonts w:ascii="Tahoma" w:eastAsia="Tahoma" w:hAnsi="Tahoma" w:cs="Tahoma"/>
-                <w:sz w:val="22"/>
-                <w:szCs w:val="22"/>
-              </w:rPr>
-            </w:pPr>
-            <w:r>
-              <w:rPr>
-                <w:rFonts w:ascii="Tahoma" w:eastAsia="Tahoma" w:hAnsi="Tahoma" w:cs="Tahoma"/>
-                <w:sz w:val="22"/>
-                <w:szCs w:val="22"/>
-              </w:rPr>
-              <w:t>1</w:t>
+            <w:r>
+              <w:t>1. Salam &amp; Perkenalan</w:t>
+              <w:br/>
+              <w:t>2. Safety induction lab</w:t>
+              <w:br/>
+              <w:t>3. Apersepsi peran Desainer Grafis</w:t>
+              <w:br/>
+              <w:t>4. Roadmap pelatihan</w:t>
             </w:r>
           </w:p>
         </w:tc>
@@ -1451,72 +1445,9 @@
             <w:gridSpan w:val="3"/>
           </w:tcPr>
           <w:p>
-            <w:pPr>
-              <w:pStyle w:val="ListParagraph"/>
-              <w:numPr>
-                <w:ilvl w:val="3"/>
-                <w:numId w:val="5"/>
-              </w:numPr>
-              <w:spacing w:before="60"/>
-              <w:ind w:left="292"/>
-              <w:rPr>
-                <w:rFonts w:ascii="Tahoma" w:eastAsia="Tahoma" w:hAnsi="Tahoma" w:cs="Tahoma"/>
-                <w:b/>
-              </w:rPr>
-            </w:pPr>
-            <w:r>
-              <w:rPr>
-                <w:rFonts w:ascii="Tahoma" w:eastAsia="Tahoma" w:hAnsi="Tahoma" w:cs="Tahoma"/>
-                <w:b/>
-              </w:rPr>
-              <w:t>Dasar-dasar Copywriting</w:t>
-            </w:r>
-          </w:p>
-          <w:p>
-            <w:pPr>
-              <w:spacing w:before="60"/>
-              <w:rPr>
-                <w:rFonts w:ascii="Tahoma" w:eastAsia="Tahoma" w:hAnsi="Tahoma" w:cs="Tahoma"/>
-                <w:b/>
-              </w:rPr>
-            </w:pPr>
-          </w:p>
-          <w:p>
-            <w:pPr>
-              <w:spacing w:before="60"/>
-              <w:rPr>
-                <w:rFonts w:ascii="Tahoma" w:eastAsia="Tahoma" w:hAnsi="Tahoma" w:cs="Tahoma"/>
-                <w:b/>
-              </w:rPr>
-            </w:pPr>
-          </w:p>
-          <w:p>
-            <w:pPr>
-              <w:spacing w:before="60"/>
-              <w:rPr>
-                <w:rFonts w:ascii="Tahoma" w:eastAsia="Tahoma" w:hAnsi="Tahoma" w:cs="Tahoma"/>
-                <w:b/>
-              </w:rPr>
-            </w:pPr>
-          </w:p>
-          <w:p>
-            <w:pPr>
-              <w:spacing w:before="60"/>
-              <w:rPr>
-                <w:rFonts w:ascii="Tahoma" w:eastAsia="Tahoma" w:hAnsi="Tahoma" w:cs="Tahoma"/>
-                <w:b/>
-              </w:rPr>
-            </w:pPr>
-          </w:p>
-          <w:p>
-            <w:pPr>
-              <w:pStyle w:val="ListParagraph"/>
-              <w:spacing w:before="60"/>
-              <w:rPr>
-                <w:rFonts w:ascii="Tahoma" w:eastAsia="Tahoma" w:hAnsi="Tahoma" w:cs="Tahoma"/>
-                <w:b/>
-              </w:rPr>
-            </w:pPr>
+            <w:r>
+              <w:t>Konsep Dasar DKV &amp; Analisis Brief</w:t>
+            </w:r>
           </w:p>
         </w:tc>
         <w:tc>
@@ -1525,26 +1456,9 @@
             <w:gridSpan w:val="2"/>
           </w:tcPr>
           <w:p>
-            <w:pPr>
-              <w:pStyle w:val="ListParagraph"/>
-              <w:numPr>
-                <w:ilvl w:val="0"/>
-                <w:numId w:val="4"/>
-              </w:numPr>
-              <w:pBdr>
-                <w:top w:val="nil"/>
-                <w:left w:val="nil"/>
-                <w:bottom w:val="nil"/>
-                <w:right w:val="nil"/>
-                <w:between w:val="nil"/>
-              </w:pBdr>
-              <w:spacing w:before="60"/>
-              <w:ind w:left="171" w:right="89" w:hanging="283"/>
-              <w:rPr>
-                <w:rFonts w:ascii="Tahoma" w:eastAsia="Tahoma" w:hAnsi="Tahoma" w:cs="Tahoma"/>
-                <w:color w:val="000000"/>
-              </w:rPr>
-            </w:pPr>
+            <w:r>
+              <w:t>Penjelasan ruang lingkup profesi Desainer Grafis Muda dan cara membedah komponen kunci dalam Design Brief.</w:t>
+            </w:r>
           </w:p>
         </w:tc>
         <w:tc>
@@ -1601,25 +1515,8 @@
             <w:gridSpan w:val="3"/>
           </w:tcPr>
           <w:p>
-            <w:pPr>
-              <w:pStyle w:val="ListParagraph"/>
-              <w:numPr>
-                <w:ilvl w:val="3"/>
-                <w:numId w:val="5"/>
-              </w:numPr>
-              <w:spacing w:before="60"/>
-              <w:ind w:left="292"/>
-              <w:rPr>
-                <w:rFonts w:ascii="Tahoma" w:eastAsia="Tahoma" w:hAnsi="Tahoma" w:cs="Tahoma"/>
-                <w:b/>
-              </w:rPr>
-            </w:pPr>
-            <w:r>
-              <w:rPr>
-                <w:rFonts w:ascii="Tahoma" w:eastAsia="Tahoma" w:hAnsi="Tahoma" w:cs="Tahoma"/>
-                <w:b/>
-              </w:rPr>
-              <w:t>Pengenalan Tools AI ( ChatGPT dan Canva AI)</w:t>
+            <w:r>
+              <w:t>Demonstrasi Bedah Brief</w:t>
             </w:r>
           </w:p>
         </w:tc>
@@ -1629,27 +1526,9 @@
             <w:gridSpan w:val="2"/>
           </w:tcPr>
           <w:p>
-            <w:pPr>
-              <w:numPr>
-                <w:ilvl w:val="0"/>
-                <w:numId w:val="4"/>
-              </w:numPr>
-              <w:pBdr>
-                <w:top w:val="nil"/>
-                <w:left w:val="nil"/>
-                <w:bottom w:val="nil"/>
-                <w:right w:val="nil"/>
-                <w:between w:val="nil"/>
-              </w:pBdr>
-              <w:spacing w:before="60" w:line="276" w:lineRule="auto"/>
-              <w:ind w:left="171" w:right="89" w:hanging="283"/>
-              <w:rPr>
-                <w:rFonts w:ascii="Tahoma" w:eastAsia="Tahoma" w:hAnsi="Tahoma" w:cs="Tahoma"/>
-                <w:color w:val="000000"/>
-                <w:sz w:val="22"/>
-                <w:szCs w:val="22"/>
-              </w:rPr>
-            </w:pPr>
+            <w:r>
+              <w:t>Praktik ekstraksi keyword dari brief sampel dan pemetaan target audiens.</w:t>
+            </w:r>
           </w:p>
         </w:tc>
         <w:tc>
@@ -1706,25 +1585,8 @@
             <w:gridSpan w:val="3"/>
           </w:tcPr>
           <w:p>
-            <w:pPr>
-              <w:pStyle w:val="ListParagraph"/>
-              <w:numPr>
-                <w:ilvl w:val="3"/>
-                <w:numId w:val="5"/>
-              </w:numPr>
-              <w:spacing w:before="60"/>
-              <w:ind w:left="292"/>
-              <w:rPr>
-                <w:rFonts w:ascii="Tahoma" w:eastAsia="Tahoma" w:hAnsi="Tahoma" w:cs="Tahoma"/>
-                <w:b/>
-              </w:rPr>
-            </w:pPr>
-            <w:r>
-              <w:rPr>
-                <w:rFonts w:ascii="Tahoma" w:eastAsia="Tahoma" w:hAnsi="Tahoma" w:cs="Tahoma"/>
-                <w:b/>
-              </w:rPr>
-              <w:t>Batasan dan Etika dalam menggunakan AI</w:t>
+            <w:r>
+              <w:t>Praktik Analisis Brief</w:t>
             </w:r>
           </w:p>
         </w:tc>
@@ -1734,27 +1596,9 @@
             <w:gridSpan w:val="2"/>
           </w:tcPr>
           <w:p>
-            <w:pPr>
-              <w:numPr>
-                <w:ilvl w:val="0"/>
-                <w:numId w:val="4"/>
-              </w:numPr>
-              <w:pBdr>
-                <w:top w:val="nil"/>
-                <w:left w:val="nil"/>
-                <w:bottom w:val="nil"/>
-                <w:right w:val="nil"/>
-                <w:between w:val="nil"/>
-              </w:pBdr>
-              <w:spacing w:before="60" w:line="276" w:lineRule="auto"/>
-              <w:ind w:left="171" w:right="89" w:hanging="283"/>
-              <w:rPr>
-                <w:rFonts w:ascii="Tahoma" w:eastAsia="Tahoma" w:hAnsi="Tahoma" w:cs="Tahoma"/>
-                <w:color w:val="000000"/>
-                <w:sz w:val="22"/>
-                <w:szCs w:val="22"/>
-              </w:rPr>
-            </w:pPr>
+            <w:r>
+              <w:t>Peserta menganalisis sampel brief riil dan menentukan output yang diminta klien.</w:t>
+            </w:r>
           </w:p>
         </w:tc>
         <w:tc>
@@ -1839,27 +1683,9 @@
             <w:gridSpan w:val="2"/>
           </w:tcPr>
           <w:p>
-            <w:pPr>
-              <w:numPr>
-                <w:ilvl w:val="0"/>
-                <w:numId w:val="4"/>
-              </w:numPr>
-              <w:pBdr>
-                <w:top w:val="nil"/>
-                <w:left w:val="nil"/>
-                <w:bottom w:val="nil"/>
-                <w:right w:val="nil"/>
-                <w:between w:val="nil"/>
-              </w:pBdr>
-              <w:spacing w:before="60" w:line="276" w:lineRule="auto"/>
-              <w:ind w:left="171" w:right="89" w:hanging="283"/>
-              <w:rPr>
-                <w:rFonts w:ascii="Tahoma" w:eastAsia="Tahoma" w:hAnsi="Tahoma" w:cs="Tahoma"/>
-                <w:color w:val="000000"/>
-                <w:sz w:val="22"/>
-                <w:szCs w:val="22"/>
-              </w:rPr>
-            </w:pPr>
+            <w:r>
+              <w:t>Pentingnya fondasi brief sebelum eksekusi.</w:t>
+            </w:r>
           </w:p>
         </w:tc>
         <w:tc>
@@ -1946,27 +1772,9 @@
             <w:gridSpan w:val="2"/>
           </w:tcPr>
           <w:p>
-            <w:pPr>
-              <w:numPr>
-                <w:ilvl w:val="0"/>
-                <w:numId w:val="4"/>
-              </w:numPr>
-              <w:pBdr>
-                <w:top w:val="nil"/>
-                <w:left w:val="nil"/>
-                <w:bottom w:val="nil"/>
-                <w:right w:val="nil"/>
-                <w:between w:val="nil"/>
-              </w:pBdr>
-              <w:spacing w:before="60" w:line="276" w:lineRule="auto"/>
-              <w:ind w:left="201" w:right="89" w:hanging="283"/>
-              <w:rPr>
-                <w:rFonts w:ascii="Tahoma" w:eastAsia="Tahoma" w:hAnsi="Tahoma" w:cs="Tahoma"/>
-                <w:color w:val="000000"/>
-                <w:sz w:val="22"/>
-                <w:szCs w:val="22"/>
-              </w:rPr>
-            </w:pPr>
+            <w:r>
+              <w:t>Kuis komponen brief.</w:t>
+            </w:r>
           </w:p>
         </w:tc>
         <w:tc>
@@ -2064,27 +1872,9 @@
             <w:gridSpan w:val="2"/>
           </w:tcPr>
           <w:p>
-            <w:pPr>
-              <w:numPr>
-                <w:ilvl w:val="0"/>
-                <w:numId w:val="4"/>
-              </w:numPr>
-              <w:pBdr>
-                <w:top w:val="nil"/>
-                <w:left w:val="nil"/>
-                <w:bottom w:val="nil"/>
-                <w:right w:val="nil"/>
-                <w:between w:val="nil"/>
-              </w:pBdr>
-              <w:spacing w:before="60" w:line="276" w:lineRule="auto"/>
-              <w:ind w:left="201" w:right="89" w:hanging="335"/>
-              <w:rPr>
-                <w:rFonts w:ascii="Tahoma" w:eastAsia="Tahoma" w:hAnsi="Tahoma" w:cs="Tahoma"/>
-                <w:color w:val="000000"/>
-                <w:sz w:val="22"/>
-                <w:szCs w:val="22"/>
-              </w:rPr>
-            </w:pPr>
+            <w:r>
+              <w:t>Jobsheet 01: Analisis Brief.</w:t>
+            </w:r>
           </w:p>
         </w:tc>
         <w:tc>

</xml_diff>

<commit_message>
Fix: Fully populate Pertemuan 1 docx table content
</commit_message>
<xml_diff>
--- a/lesson-plans/lessonplan_pertemuan01.docx
+++ b/lesson-plans/lessonplan_pertemuan01.docx
@@ -179,28 +179,9 @@
             <w:vAlign w:val="center"/>
           </w:tcPr>
           <w:p>
-            <w:pPr>
-              <w:spacing w:before="60" w:after="60"/>
-              <w:rPr>
-                <w:rFonts w:ascii="Tahoma" w:eastAsia="Tahoma" w:hAnsi="Tahoma" w:cs="Tahoma"/>
-                <w:b/>
-                <w:sz w:val="22"/>
-                <w:szCs w:val="22"/>
-                <w:lang w:val="en-US"/>
-              </w:rPr>
-            </w:pPr>
-            <w:proofErr w:type="spellStart"/>
-            <w:r>
-              <w:rPr>
-                <w:rFonts w:ascii="Tahoma" w:eastAsia="Tahoma" w:hAnsi="Tahoma" w:cs="Tahoma"/>
-                <w:b/>
-                <w:sz w:val="22"/>
-                <w:szCs w:val="22"/>
-                <w:lang w:val="en-US"/>
-              </w:rPr>
+            <w:r>
               <w:t>Kejuruan</w:t>
             </w:r>
-            <w:proofErr w:type="spellEnd"/>
           </w:p>
         </w:tc>
         <w:tc>
@@ -208,6 +189,40 @@
             <w:tcW w:w="283" w:type="dxa"/>
             <w:tcBorders>
               <w:left w:val="nil"/>
+              <w:right w:val="nil"/>
+            </w:tcBorders>
+            <w:vAlign w:val="center"/>
+          </w:tcPr>
+          <w:p>
+            <w:r>
+              <w:t>:</w:t>
+            </w:r>
+          </w:p>
+        </w:tc>
+        <w:tc>
+          <w:tcPr>
+            <w:tcW w:w="2385" w:type="dxa"/>
+            <w:gridSpan w:val="3"/>
+            <w:tcBorders>
+              <w:left w:val="nil"/>
+            </w:tcBorders>
+            <w:vAlign w:val="center"/>
+          </w:tcPr>
+          <w:p>
+            <w:r>
+              <w:t>Teknologi Informasi dan Komunikasi (TIK)</w:t>
+            </w:r>
+          </w:p>
+        </w:tc>
+      </w:tr>
+      <w:tr>
+        <w:trPr>
+          <w:trHeight w:val="278"/>
+        </w:trPr>
+        <w:tc>
+          <w:tcPr>
+            <w:tcW w:w="1962" w:type="dxa"/>
+            <w:tcBorders>
               <w:right w:val="nil"/>
             </w:tcBorders>
             <w:vAlign w:val="center"/>
@@ -229,34 +244,15 @@
                 <w:sz w:val="22"/>
                 <w:szCs w:val="22"/>
               </w:rPr>
-              <w:t>:</w:t>
-            </w:r>
-          </w:p>
-        </w:tc>
-        <w:tc>
-          <w:tcPr>
-            <w:tcW w:w="2385" w:type="dxa"/>
-            <w:gridSpan w:val="3"/>
+              <w:t>Kode Unit Kompetensi</w:t>
+            </w:r>
+          </w:p>
+        </w:tc>
+        <w:tc>
+          <w:tcPr>
+            <w:tcW w:w="296" w:type="dxa"/>
             <w:tcBorders>
               <w:left w:val="nil"/>
-            </w:tcBorders>
-            <w:vAlign w:val="center"/>
-          </w:tcPr>
-          <w:p>
-            <w:r>
-              <w:t>TIK</w:t>
-            </w:r>
-          </w:p>
-        </w:tc>
-      </w:tr>
-      <w:tr>
-        <w:trPr>
-          <w:trHeight w:val="278"/>
-        </w:trPr>
-        <w:tc>
-          <w:tcPr>
-            <w:tcW w:w="1962" w:type="dxa"/>
-            <w:tcBorders>
               <w:right w:val="nil"/>
             </w:tcBorders>
             <w:vAlign w:val="center"/>
@@ -278,15 +274,79 @@
                 <w:sz w:val="22"/>
                 <w:szCs w:val="22"/>
               </w:rPr>
-              <w:t>Kode Unit Kompetensi</w:t>
-            </w:r>
-          </w:p>
-        </w:tc>
-        <w:tc>
-          <w:tcPr>
-            <w:tcW w:w="296" w:type="dxa"/>
+              <w:t>:</w:t>
+            </w:r>
+          </w:p>
+        </w:tc>
+        <w:tc>
+          <w:tcPr>
+            <w:tcW w:w="2994" w:type="dxa"/>
+            <w:gridSpan w:val="2"/>
             <w:tcBorders>
               <w:left w:val="nil"/>
+            </w:tcBorders>
+            <w:vAlign w:val="center"/>
+          </w:tcPr>
+          <w:p>
+            <w:r>
+              <w:t>M.74DKV13.012.2</w:t>
+            </w:r>
+          </w:p>
+        </w:tc>
+        <w:tc>
+          <w:tcPr>
+            <w:tcW w:w="1944" w:type="dxa"/>
+            <w:gridSpan w:val="2"/>
+            <w:tcBorders>
+              <w:right w:val="nil"/>
+            </w:tcBorders>
+            <w:vAlign w:val="center"/>
+          </w:tcPr>
+          <w:p>
+            <w:r>
+              <w:t>Penyajian ke</w:t>
+            </w:r>
+          </w:p>
+        </w:tc>
+        <w:tc>
+          <w:tcPr>
+            <w:tcW w:w="283" w:type="dxa"/>
+            <w:tcBorders>
+              <w:left w:val="nil"/>
+              <w:right w:val="nil"/>
+            </w:tcBorders>
+            <w:vAlign w:val="center"/>
+          </w:tcPr>
+          <w:p>
+            <w:r>
+              <w:t>:</w:t>
+            </w:r>
+          </w:p>
+        </w:tc>
+        <w:tc>
+          <w:tcPr>
+            <w:tcW w:w="2385" w:type="dxa"/>
+            <w:gridSpan w:val="3"/>
+            <w:tcBorders>
+              <w:left w:val="nil"/>
+            </w:tcBorders>
+            <w:vAlign w:val="center"/>
+          </w:tcPr>
+          <w:p>
+            <w:r>
+              <w:t>1</w:t>
+            </w:r>
+          </w:p>
+        </w:tc>
+      </w:tr>
+      <w:tr>
+        <w:trPr>
+          <w:trHeight w:val="60"/>
+        </w:trPr>
+        <w:tc>
+          <w:tcPr>
+            <w:tcW w:w="1962" w:type="dxa"/>
+            <w:tcBorders>
               <w:right w:val="nil"/>
             </w:tcBorders>
             <w:vAlign w:val="center"/>
@@ -308,30 +368,15 @@
                 <w:sz w:val="22"/>
                 <w:szCs w:val="22"/>
               </w:rPr>
-              <w:t>:</w:t>
-            </w:r>
-          </w:p>
-        </w:tc>
-        <w:tc>
-          <w:tcPr>
-            <w:tcW w:w="2994" w:type="dxa"/>
-            <w:gridSpan w:val="2"/>
+              <w:t>Judul Unit Kompetensi</w:t>
+            </w:r>
+          </w:p>
+        </w:tc>
+        <w:tc>
+          <w:tcPr>
+            <w:tcW w:w="296" w:type="dxa"/>
             <w:tcBorders>
               <w:left w:val="nil"/>
-            </w:tcBorders>
-            <w:vAlign w:val="center"/>
-          </w:tcPr>
-          <w:p>
-            <w:r>
-              <w:t>M.74DKV13.012.2</w:t>
-            </w:r>
-          </w:p>
-        </w:tc>
-        <w:tc>
-          <w:tcPr>
-            <w:tcW w:w="1944" w:type="dxa"/>
-            <w:gridSpan w:val="2"/>
-            <w:tcBorders>
               <w:right w:val="nil"/>
             </w:tcBorders>
             <w:vAlign w:val="center"/>
@@ -353,7 +398,37 @@
                 <w:sz w:val="22"/>
                 <w:szCs w:val="22"/>
               </w:rPr>
-              <w:t>Penyajian ke</w:t>
+              <w:t>:</w:t>
+            </w:r>
+          </w:p>
+        </w:tc>
+        <w:tc>
+          <w:tcPr>
+            <w:tcW w:w="2994" w:type="dxa"/>
+            <w:gridSpan w:val="2"/>
+            <w:tcBorders>
+              <w:left w:val="nil"/>
+            </w:tcBorders>
+            <w:vAlign w:val="center"/>
+          </w:tcPr>
+          <w:p>
+            <w:r>
+              <w:t>Menciptakan Karya Desain</w:t>
+            </w:r>
+          </w:p>
+        </w:tc>
+        <w:tc>
+          <w:tcPr>
+            <w:tcW w:w="1944" w:type="dxa"/>
+            <w:gridSpan w:val="2"/>
+            <w:tcBorders>
+              <w:right w:val="nil"/>
+            </w:tcBorders>
+            <w:vAlign w:val="center"/>
+          </w:tcPr>
+          <w:p>
+            <w:r>
+              <w:t>Waktu</w:t>
             </w:r>
           </w:p>
         </w:tc>
@@ -367,22 +442,7 @@
             <w:vAlign w:val="center"/>
           </w:tcPr>
           <w:p>
-            <w:pPr>
-              <w:spacing w:before="60" w:after="60"/>
-              <w:rPr>
-                <w:rFonts w:ascii="Tahoma" w:eastAsia="Tahoma" w:hAnsi="Tahoma" w:cs="Tahoma"/>
-                <w:b/>
-                <w:sz w:val="22"/>
-                <w:szCs w:val="22"/>
-              </w:rPr>
-            </w:pPr>
-            <w:r>
-              <w:rPr>
-                <w:rFonts w:ascii="Tahoma" w:eastAsia="Tahoma" w:hAnsi="Tahoma" w:cs="Tahoma"/>
-                <w:b/>
-                <w:sz w:val="22"/>
-                <w:szCs w:val="22"/>
-              </w:rPr>
+            <w:r>
               <w:t>:</w:t>
             </w:r>
           </w:p>
@@ -398,166 +458,20 @@
           </w:tcPr>
           <w:p>
             <w:r>
-              <w:t>1</w:t>
+              <w:t>180 menit</w:t>
             </w:r>
           </w:p>
         </w:tc>
       </w:tr>
       <w:tr>
-        <w:trPr>
-          <w:trHeight w:val="60"/>
-        </w:trPr>
-        <w:tc>
-          <w:tcPr>
-            <w:tcW w:w="1962" w:type="dxa"/>
-            <w:tcBorders>
-              <w:right w:val="nil"/>
-            </w:tcBorders>
-            <w:vAlign w:val="center"/>
-          </w:tcPr>
-          <w:p>
-            <w:pPr>
-              <w:spacing w:before="60" w:after="60"/>
-              <w:rPr>
-                <w:rFonts w:ascii="Tahoma" w:eastAsia="Tahoma" w:hAnsi="Tahoma" w:cs="Tahoma"/>
-                <w:b/>
-                <w:sz w:val="22"/>
-                <w:szCs w:val="22"/>
-              </w:rPr>
-            </w:pPr>
-            <w:r>
-              <w:rPr>
-                <w:rFonts w:ascii="Tahoma" w:eastAsia="Tahoma" w:hAnsi="Tahoma" w:cs="Tahoma"/>
-                <w:b/>
-                <w:sz w:val="22"/>
-                <w:szCs w:val="22"/>
-              </w:rPr>
-              <w:t>Judul Unit Kompetensi</w:t>
-            </w:r>
-          </w:p>
-        </w:tc>
-        <w:tc>
-          <w:tcPr>
-            <w:tcW w:w="296" w:type="dxa"/>
-            <w:tcBorders>
-              <w:left w:val="nil"/>
-              <w:right w:val="nil"/>
-            </w:tcBorders>
-            <w:vAlign w:val="center"/>
-          </w:tcPr>
-          <w:p>
-            <w:pPr>
-              <w:spacing w:before="60" w:after="60"/>
-              <w:rPr>
-                <w:rFonts w:ascii="Tahoma" w:eastAsia="Tahoma" w:hAnsi="Tahoma" w:cs="Tahoma"/>
-                <w:b/>
-                <w:sz w:val="22"/>
-                <w:szCs w:val="22"/>
-              </w:rPr>
-            </w:pPr>
-            <w:r>
-              <w:rPr>
-                <w:rFonts w:ascii="Tahoma" w:eastAsia="Tahoma" w:hAnsi="Tahoma" w:cs="Tahoma"/>
-                <w:b/>
-                <w:sz w:val="22"/>
-                <w:szCs w:val="22"/>
-              </w:rPr>
-              <w:t>:</w:t>
-            </w:r>
-          </w:p>
-        </w:tc>
-        <w:tc>
-          <w:tcPr>
-            <w:tcW w:w="2994" w:type="dxa"/>
-            <w:gridSpan w:val="2"/>
-            <w:tcBorders>
-              <w:left w:val="nil"/>
-            </w:tcBorders>
-            <w:vAlign w:val="center"/>
-          </w:tcPr>
-          <w:p>
-            <w:pPr>
-              <w:spacing w:before="60" w:after="60"/>
-              <w:rPr>
-                <w:rFonts w:ascii="Tahoma" w:eastAsia="Tahoma" w:hAnsi="Tahoma" w:cs="Tahoma"/>
-                <w:sz w:val="22"/>
-                <w:szCs w:val="22"/>
-              </w:rPr>
-            </w:pPr>
-          </w:p>
-        </w:tc>
-        <w:tc>
-          <w:tcPr>
-            <w:tcW w:w="1944" w:type="dxa"/>
-            <w:gridSpan w:val="2"/>
-            <w:tcBorders>
-              <w:right w:val="nil"/>
-            </w:tcBorders>
-            <w:vAlign w:val="center"/>
-          </w:tcPr>
-          <w:p>
-            <w:pPr>
-              <w:spacing w:before="60" w:after="60"/>
-              <w:rPr>
-                <w:rFonts w:ascii="Tahoma" w:eastAsia="Tahoma" w:hAnsi="Tahoma" w:cs="Tahoma"/>
-                <w:b/>
-                <w:sz w:val="22"/>
-                <w:szCs w:val="22"/>
-              </w:rPr>
-            </w:pPr>
-            <w:r>
-              <w:rPr>
-                <w:rFonts w:ascii="Tahoma" w:eastAsia="Tahoma" w:hAnsi="Tahoma" w:cs="Tahoma"/>
-                <w:b/>
-                <w:sz w:val="22"/>
-                <w:szCs w:val="22"/>
-              </w:rPr>
-              <w:t xml:space="preserve">Waktu </w:t>
-            </w:r>
-          </w:p>
-        </w:tc>
-        <w:tc>
-          <w:tcPr>
-            <w:tcW w:w="283" w:type="dxa"/>
-            <w:tcBorders>
-              <w:left w:val="nil"/>
-              <w:right w:val="nil"/>
-            </w:tcBorders>
-            <w:vAlign w:val="center"/>
-          </w:tcPr>
-          <w:p>
-            <w:pPr>
-              <w:spacing w:before="60" w:after="60"/>
-              <w:rPr>
-                <w:rFonts w:ascii="Tahoma" w:eastAsia="Tahoma" w:hAnsi="Tahoma" w:cs="Tahoma"/>
-                <w:b/>
-                <w:sz w:val="22"/>
-                <w:szCs w:val="22"/>
-              </w:rPr>
-            </w:pPr>
-            <w:r>
-              <w:rPr>
-                <w:rFonts w:ascii="Tahoma" w:eastAsia="Tahoma" w:hAnsi="Tahoma" w:cs="Tahoma"/>
-                <w:b/>
-                <w:sz w:val="22"/>
-                <w:szCs w:val="22"/>
-              </w:rPr>
-              <w:t>:</w:t>
-            </w:r>
-          </w:p>
-        </w:tc>
-        <w:tc>
-          <w:tcPr>
-            <w:tcW w:w="2385" w:type="dxa"/>
-            <w:gridSpan w:val="3"/>
-            <w:tcBorders>
-              <w:left w:val="nil"/>
-            </w:tcBorders>
-            <w:vAlign w:val="center"/>
-          </w:tcPr>
-          <w:p>
-            <w:r>
-              <w:t>180 menit</w:t>
+        <w:tc>
+          <w:tcPr>
+            <w:tcW w:w="9864" w:type="dxa"/>
+            <w:gridSpan w:val="10"/>
+          </w:tcPr>
+          <w:p>
+            <w:r>
+              <w:t>Pengenalan Desain Grafis, Design Brief, &amp; Prosedur K3 TIK</w:t>
             </w:r>
           </w:p>
         </w:tc>
@@ -570,20 +484,7 @@
           </w:tcPr>
           <w:p>
             <w:r>
-              <w:t>Pengenalan Desain Grafis, Design Brief, &amp; K3 TIK</w:t>
-            </w:r>
-          </w:p>
-        </w:tc>
-      </w:tr>
-      <w:tr>
-        <w:tc>
-          <w:tcPr>
-            <w:tcW w:w="9864" w:type="dxa"/>
-            <w:gridSpan w:val="10"/>
-          </w:tcPr>
-          <w:p>
-            <w:r>
-              <w:t>Memahami peran desainer, analisis brief, dan prosedur K3 TIK secara disiplin.</w:t>
+              <w:t>Setelah selesai mengikuti pelatihan ini peserta kompeten dalam memahami ruang lingkup desainer grafis, menganalisis isi design brief, serta menerapkan prosedur K3 TIK dan safety induction secara disiplin.</w:t>
             </w:r>
           </w:p>
         </w:tc>
@@ -601,6 +502,72 @@
             <w:tcBorders>
               <w:bottom w:val="single" w:sz="4" w:space="0" w:color="000000"/>
             </w:tcBorders>
+          </w:tcPr>
+          <w:p>
+            <w:r>
+              <w:t>Metode Mengajar</w:t>
+            </w:r>
+          </w:p>
+        </w:tc>
+        <w:tc>
+          <w:tcPr>
+            <w:tcW w:w="7189" w:type="dxa"/>
+            <w:gridSpan w:val="6"/>
+          </w:tcPr>
+          <w:p>
+            <w:r>
+              <w:t>Ceramah</w:t>
+              <w:br/>
+              <w:t>Diskusi</w:t>
+              <w:br/>
+              <w:t>Praktikum</w:t>
+            </w:r>
+          </w:p>
+        </w:tc>
+      </w:tr>
+      <w:tr>
+        <w:trPr>
+          <w:gridAfter w:val="1"/>
+          <w:wAfter w:w="10" w:type="dxa"/>
+          <w:trHeight w:val="754"/>
+        </w:trPr>
+        <w:tc>
+          <w:tcPr>
+            <w:tcW w:w="2665" w:type="dxa"/>
+            <w:gridSpan w:val="3"/>
+            <w:vMerge w:val="restart"/>
+          </w:tcPr>
+          <w:p>
+            <w:r>
+              <w:t>Media Pembelajaran</w:t>
+              <w:br/>
+              <w:t>(Media, Alat, Bahan)</w:t>
+            </w:r>
+          </w:p>
+        </w:tc>
+        <w:tc>
+          <w:tcPr>
+            <w:tcW w:w="7189" w:type="dxa"/>
+            <w:gridSpan w:val="6"/>
+          </w:tcPr>
+          <w:p>
+            <w:r>
+              <w:t>Media Power Point, Gambar Ilustrasi &amp; Contoh Dokumen Design Brief</w:t>
+            </w:r>
+          </w:p>
+        </w:tc>
+      </w:tr>
+      <w:tr>
+        <w:trPr>
+          <w:gridAfter w:val="1"/>
+          <w:wAfter w:w="10" w:type="dxa"/>
+          <w:trHeight w:val="754"/>
+        </w:trPr>
+        <w:tc>
+          <w:tcPr>
+            <w:tcW w:w="2665" w:type="dxa"/>
+            <w:gridSpan w:val="3"/>
+            <w:vMerge/>
           </w:tcPr>
           <w:p>
             <w:pPr>
@@ -613,15 +580,6 @@
                 <w:szCs w:val="22"/>
               </w:rPr>
             </w:pPr>
-            <w:r>
-              <w:rPr>
-                <w:rFonts w:ascii="Tahoma" w:eastAsia="Tahoma" w:hAnsi="Tahoma" w:cs="Tahoma"/>
-                <w:b/>
-                <w:sz w:val="22"/>
-                <w:szCs w:val="22"/>
-              </w:rPr>
-              <w:t>Metode Mengajar</w:t>
-            </w:r>
           </w:p>
         </w:tc>
         <w:tc>
@@ -630,28 +588,9 @@
             <w:gridSpan w:val="6"/>
           </w:tcPr>
           <w:p>
-            <w:pPr>
-              <w:numPr>
-                <w:ilvl w:val="0"/>
-                <w:numId w:val="2"/>
-              </w:numPr>
-              <w:pBdr>
-                <w:top w:val="nil"/>
-                <w:left w:val="nil"/>
-                <w:bottom w:val="nil"/>
-                <w:right w:val="nil"/>
-                <w:between w:val="nil"/>
-              </w:pBdr>
-              <w:spacing w:after="120"/>
-              <w:ind w:left="294" w:hanging="284"/>
-              <w:jc w:val="both"/>
-              <w:rPr>
-                <w:rFonts w:ascii="Tahoma" w:eastAsia="Tahoma" w:hAnsi="Tahoma" w:cs="Tahoma"/>
-                <w:color w:val="000000" w:themeColor="text1"/>
-                <w:sz w:val="22"/>
-                <w:szCs w:val="22"/>
-              </w:rPr>
-            </w:pPr>
+            <w:r>
+              <w:t>Alat Proyektor dan Layar, Perangkat Komputer / Workstation Lab, Papan Tulis, Spidol dan Penghapus</w:t>
+            </w:r>
           </w:p>
         </w:tc>
       </w:tr>
@@ -665,7 +604,10 @@
           <w:tcPr>
             <w:tcW w:w="2665" w:type="dxa"/>
             <w:gridSpan w:val="3"/>
-            <w:vMerge w:val="restart"/>
+            <w:vMerge/>
+            <w:tcBorders>
+              <w:bottom w:val="nil"/>
+            </w:tcBorders>
           </w:tcPr>
           <w:p>
             <w:pPr>
@@ -678,43 +620,6 @@
                 <w:szCs w:val="22"/>
               </w:rPr>
             </w:pPr>
-            <w:r>
-              <w:rPr>
-                <w:rFonts w:ascii="Tahoma" w:eastAsia="Tahoma" w:hAnsi="Tahoma" w:cs="Tahoma"/>
-                <w:b/>
-                <w:sz w:val="22"/>
-                <w:szCs w:val="22"/>
-              </w:rPr>
-              <w:t>Media Pembelajaran</w:t>
-            </w:r>
-          </w:p>
-          <w:p>
-            <w:pPr>
-              <w:jc w:val="both"/>
-              <w:rPr>
-                <w:rFonts w:ascii="Tahoma" w:eastAsia="Tahoma" w:hAnsi="Tahoma" w:cs="Tahoma"/>
-                <w:sz w:val="22"/>
-                <w:szCs w:val="22"/>
-              </w:rPr>
-            </w:pPr>
-            <w:r>
-              <w:rPr>
-                <w:rFonts w:ascii="Tahoma" w:eastAsia="Tahoma" w:hAnsi="Tahoma" w:cs="Tahoma"/>
-                <w:sz w:val="22"/>
-                <w:szCs w:val="22"/>
-              </w:rPr>
-              <w:t>(Media, Alat, Bahan)</w:t>
-            </w:r>
-          </w:p>
-          <w:p>
-            <w:pPr>
-              <w:jc w:val="both"/>
-              <w:rPr>
-                <w:rFonts w:ascii="Tahoma" w:eastAsia="Tahoma" w:hAnsi="Tahoma" w:cs="Tahoma"/>
-                <w:sz w:val="22"/>
-                <w:szCs w:val="22"/>
-              </w:rPr>
-            </w:pPr>
           </w:p>
         </w:tc>
         <w:tc>
@@ -723,230 +628,9 @@
             <w:gridSpan w:val="6"/>
           </w:tcPr>
           <w:p>
-            <w:pPr>
-              <w:pBdr>
-                <w:top w:val="nil"/>
-                <w:left w:val="nil"/>
-                <w:bottom w:val="nil"/>
-                <w:right w:val="nil"/>
-                <w:between w:val="nil"/>
-              </w:pBdr>
-              <w:spacing w:before="120" w:line="276" w:lineRule="auto"/>
-              <w:ind w:left="52"/>
-              <w:jc w:val="both"/>
-              <w:rPr>
-                <w:rFonts w:ascii="Tahoma" w:eastAsia="Tahoma" w:hAnsi="Tahoma" w:cs="Tahoma"/>
-                <w:color w:val="000000" w:themeColor="text1"/>
-                <w:sz w:val="22"/>
-                <w:szCs w:val="22"/>
-              </w:rPr>
-            </w:pPr>
-            <w:r>
-              <w:rPr>
-                <w:rFonts w:ascii="Tahoma" w:eastAsia="Tahoma" w:hAnsi="Tahoma" w:cs="Tahoma"/>
-                <w:color w:val="000000" w:themeColor="text1"/>
-                <w:sz w:val="22"/>
-                <w:szCs w:val="22"/>
-              </w:rPr>
-              <w:t>Media</w:t>
-            </w:r>
-          </w:p>
-          <w:p>
-            <w:pPr>
-              <w:numPr>
-                <w:ilvl w:val="0"/>
-                <w:numId w:val="3"/>
-              </w:numPr>
-              <w:pBdr>
-                <w:top w:val="nil"/>
-                <w:left w:val="nil"/>
-                <w:bottom w:val="nil"/>
-                <w:right w:val="nil"/>
-                <w:between w:val="nil"/>
-              </w:pBdr>
-              <w:spacing w:after="120" w:line="276" w:lineRule="auto"/>
-              <w:ind w:left="294" w:hanging="242"/>
-              <w:jc w:val="both"/>
-              <w:rPr>
-                <w:rFonts w:ascii="Tahoma" w:eastAsia="Tahoma" w:hAnsi="Tahoma" w:cs="Tahoma"/>
-                <w:color w:val="000000" w:themeColor="text1"/>
-                <w:sz w:val="22"/>
-                <w:szCs w:val="22"/>
-              </w:rPr>
-            </w:pPr>
-          </w:p>
-        </w:tc>
-      </w:tr>
-      <w:tr>
-        <w:trPr>
-          <w:gridAfter w:val="1"/>
-          <w:wAfter w:w="10" w:type="dxa"/>
-          <w:trHeight w:val="754"/>
-        </w:trPr>
-        <w:tc>
-          <w:tcPr>
-            <w:tcW w:w="2665" w:type="dxa"/>
-            <w:gridSpan w:val="3"/>
-            <w:vMerge/>
-          </w:tcPr>
-          <w:p>
-            <w:pPr>
-              <w:spacing w:before="120"/>
-              <w:jc w:val="both"/>
-              <w:rPr>
-                <w:rFonts w:ascii="Tahoma" w:eastAsia="Tahoma" w:hAnsi="Tahoma" w:cs="Tahoma"/>
-                <w:b/>
-                <w:sz w:val="22"/>
-                <w:szCs w:val="22"/>
-              </w:rPr>
-            </w:pPr>
-          </w:p>
-        </w:tc>
-        <w:tc>
-          <w:tcPr>
-            <w:tcW w:w="7189" w:type="dxa"/>
-            <w:gridSpan w:val="6"/>
-          </w:tcPr>
-          <w:p>
-            <w:pPr>
-              <w:pBdr>
-                <w:top w:val="nil"/>
-                <w:left w:val="nil"/>
-                <w:bottom w:val="nil"/>
-                <w:right w:val="nil"/>
-                <w:between w:val="nil"/>
-              </w:pBdr>
-              <w:spacing w:before="120" w:line="276" w:lineRule="auto"/>
-              <w:ind w:left="52"/>
-              <w:jc w:val="both"/>
-              <w:rPr>
-                <w:rFonts w:ascii="Tahoma" w:eastAsia="Tahoma" w:hAnsi="Tahoma" w:cs="Tahoma"/>
-                <w:color w:val="000000" w:themeColor="text1"/>
-                <w:sz w:val="22"/>
-                <w:szCs w:val="22"/>
-              </w:rPr>
-            </w:pPr>
-            <w:r>
-              <w:rPr>
-                <w:rFonts w:ascii="Tahoma" w:eastAsia="Tahoma" w:hAnsi="Tahoma" w:cs="Tahoma"/>
-                <w:color w:val="000000" w:themeColor="text1"/>
-                <w:sz w:val="22"/>
-                <w:szCs w:val="22"/>
-              </w:rPr>
-              <w:t>Alat</w:t>
-            </w:r>
-          </w:p>
-          <w:p>
-            <w:pPr>
-              <w:numPr>
-                <w:ilvl w:val="0"/>
-                <w:numId w:val="7"/>
-              </w:numPr>
-              <w:pBdr>
-                <w:top w:val="nil"/>
-                <w:left w:val="nil"/>
-                <w:bottom w:val="nil"/>
-                <w:right w:val="nil"/>
-                <w:between w:val="nil"/>
-              </w:pBdr>
-              <w:spacing w:after="120" w:line="276" w:lineRule="auto"/>
-              <w:ind w:left="294" w:hanging="242"/>
-              <w:jc w:val="both"/>
-              <w:rPr>
-                <w:rFonts w:ascii="Tahoma" w:eastAsia="Tahoma" w:hAnsi="Tahoma" w:cs="Tahoma"/>
-                <w:color w:val="000000" w:themeColor="text1"/>
-                <w:sz w:val="22"/>
-                <w:szCs w:val="22"/>
-              </w:rPr>
-            </w:pPr>
-          </w:p>
-        </w:tc>
-      </w:tr>
-      <w:tr>
-        <w:trPr>
-          <w:gridAfter w:val="1"/>
-          <w:wAfter w:w="10" w:type="dxa"/>
-          <w:trHeight w:val="754"/>
-        </w:trPr>
-        <w:tc>
-          <w:tcPr>
-            <w:tcW w:w="2665" w:type="dxa"/>
-            <w:gridSpan w:val="3"/>
-            <w:vMerge/>
-            <w:tcBorders>
-              <w:bottom w:val="nil"/>
-            </w:tcBorders>
-          </w:tcPr>
-          <w:p>
-            <w:pPr>
-              <w:spacing w:before="120"/>
-              <w:jc w:val="both"/>
-              <w:rPr>
-                <w:rFonts w:ascii="Tahoma" w:eastAsia="Tahoma" w:hAnsi="Tahoma" w:cs="Tahoma"/>
-                <w:b/>
-                <w:sz w:val="22"/>
-                <w:szCs w:val="22"/>
-              </w:rPr>
-            </w:pPr>
-          </w:p>
-        </w:tc>
-        <w:tc>
-          <w:tcPr>
-            <w:tcW w:w="7189" w:type="dxa"/>
-            <w:gridSpan w:val="6"/>
-          </w:tcPr>
-          <w:p>
-            <w:pPr>
-              <w:pBdr>
-                <w:top w:val="nil"/>
-                <w:left w:val="nil"/>
-                <w:bottom w:val="nil"/>
-                <w:right w:val="nil"/>
-                <w:between w:val="nil"/>
-              </w:pBdr>
-              <w:spacing w:before="120" w:line="276" w:lineRule="auto"/>
-              <w:ind w:left="52"/>
-              <w:jc w:val="both"/>
-              <w:rPr>
-                <w:rFonts w:ascii="Tahoma" w:eastAsia="Tahoma" w:hAnsi="Tahoma" w:cs="Tahoma"/>
-                <w:color w:val="000000" w:themeColor="text1"/>
-                <w:sz w:val="22"/>
-                <w:szCs w:val="22"/>
-              </w:rPr>
-            </w:pPr>
-            <w:r>
-              <w:rPr>
-                <w:rFonts w:ascii="Tahoma" w:eastAsia="Tahoma" w:hAnsi="Tahoma" w:cs="Tahoma"/>
-                <w:color w:val="000000" w:themeColor="text1"/>
-                <w:sz w:val="22"/>
-                <w:szCs w:val="22"/>
-              </w:rPr>
-              <w:t>Bahan</w:t>
-            </w:r>
-          </w:p>
-          <w:p>
-            <w:pPr>
-              <w:numPr>
-                <w:ilvl w:val="0"/>
-                <w:numId w:val="8"/>
-              </w:numPr>
-              <w:pBdr>
-                <w:top w:val="nil"/>
-                <w:left w:val="nil"/>
-                <w:bottom w:val="nil"/>
-                <w:right w:val="nil"/>
-                <w:between w:val="nil"/>
-              </w:pBdr>
-              <w:spacing w:after="120" w:line="276" w:lineRule="auto"/>
-              <w:ind w:left="294" w:hanging="242"/>
-              <w:jc w:val="both"/>
-              <w:rPr>
-                <w:rFonts w:ascii="Tahoma" w:eastAsia="Tahoma" w:hAnsi="Tahoma" w:cs="Tahoma"/>
-                <w:color w:val="000000" w:themeColor="text1"/>
-                <w:sz w:val="22"/>
-                <w:szCs w:val="22"/>
-              </w:rPr>
-            </w:pPr>
+            <w:r>
+              <w:t>Bahan Flashdisk, Lembar Sampel Design Brief, Buku Catatan Peserta</w:t>
+            </w:r>
           </w:p>
         </w:tc>
       </w:tr>
@@ -988,21 +672,9 @@
             <w:gridSpan w:val="6"/>
           </w:tcPr>
           <w:p>
-            <w:pPr>
-              <w:numPr>
-                <w:ilvl w:val="0"/>
-                <w:numId w:val="5"/>
-              </w:numPr>
-              <w:spacing w:after="120" w:line="276" w:lineRule="auto"/>
-              <w:ind w:left="294" w:hanging="284"/>
-              <w:jc w:val="both"/>
-              <w:rPr>
-                <w:rFonts w:ascii="Tahoma" w:eastAsia="Tahoma" w:hAnsi="Tahoma" w:cs="Tahoma"/>
-                <w:color w:val="000000" w:themeColor="text1"/>
-                <w:sz w:val="22"/>
-                <w:szCs w:val="22"/>
-              </w:rPr>
-            </w:pPr>
+            <w:r>
+              <w:t>Persiapan</w:t>
+            </w:r>
           </w:p>
         </w:tc>
       </w:tr>
@@ -1050,13 +722,17 @@
           </w:tcPr>
           <w:p>
             <w:r>
-              <w:t>1. Salam &amp; Perkenalan</w:t>
+              <w:t>1. Memberi salam dan Memperkenalkan diri</w:t>
               <w:br/>
-              <w:t>2. Safety induction lab</w:t>
+              <w:t>2. Mengabsen peserta pelatihan</w:t>
               <w:br/>
-              <w:t>3. Apersepsi peran Desainer Grafis</w:t>
+              <w:t>3. Menjelaskan safety induction dan tata tertib laboratorium TIK</w:t>
               <w:br/>
-              <w:t>4. Roadmap pelatihan</w:t>
+              <w:t>4. Mengadakan apersepsi mengenai peran dan tanggung jawab Desainer Grafis di industri</w:t>
+              <w:br/>
+              <w:t>5. Menyampaikan judul unit dan roadmap pelatihan</w:t>
+              <w:br/>
+              <w:t>6. Menyampaikan tujuan dan manfaat pembelajaran</w:t>
             </w:r>
           </w:p>
         </w:tc>
@@ -1065,24 +741,7 @@
             <w:tcW w:w="1850" w:type="dxa"/>
           </w:tcPr>
           <w:p>
-            <w:pPr>
-              <w:spacing w:before="120" w:after="120"/>
-              <w:ind w:left="26"/>
-              <w:jc w:val="center"/>
-              <w:rPr>
-                <w:rFonts w:ascii="Tahoma" w:eastAsia="Tahoma" w:hAnsi="Tahoma" w:cs="Tahoma"/>
-                <w:b/>
-                <w:sz w:val="22"/>
-                <w:szCs w:val="22"/>
-              </w:rPr>
-            </w:pPr>
-            <w:r>
-              <w:rPr>
-                <w:rFonts w:ascii="Tahoma" w:eastAsia="Tahoma" w:hAnsi="Tahoma" w:cs="Tahoma"/>
-                <w:b/>
-                <w:sz w:val="22"/>
-                <w:szCs w:val="22"/>
-              </w:rPr>
+            <w:r>
               <w:t>Perkiraan Waktu</w:t>
             </w:r>
           </w:p>
@@ -1149,15 +808,9 @@
             <w:tcW w:w="1850" w:type="dxa"/>
           </w:tcPr>
           <w:p>
-            <w:pPr>
-              <w:ind w:left="26"/>
-              <w:jc w:val="center"/>
-              <w:rPr>
-                <w:rFonts w:ascii="Tahoma" w:eastAsia="Tahoma" w:hAnsi="Tahoma" w:cs="Tahoma"/>
-                <w:sz w:val="22"/>
-                <w:szCs w:val="22"/>
-              </w:rPr>
-            </w:pPr>
+            <w:r>
+              <w:t>10 menit</w:t>
+            </w:r>
           </w:p>
         </w:tc>
       </w:tr>
@@ -1176,25 +829,7 @@
             <w:vAlign w:val="center"/>
           </w:tcPr>
           <w:p>
-            <w:pPr>
-              <w:pStyle w:val="ListParagraph"/>
-              <w:numPr>
-                <w:ilvl w:val="0"/>
-                <w:numId w:val="6"/>
-              </w:numPr>
-              <w:spacing w:before="120" w:after="120"/>
-              <w:ind w:left="294" w:hanging="284"/>
-              <w:jc w:val="both"/>
-              <w:rPr>
-                <w:rFonts w:ascii="Tahoma" w:eastAsia="Tahoma" w:hAnsi="Tahoma" w:cs="Tahoma"/>
-                <w:i/>
-              </w:rPr>
-            </w:pPr>
-            <w:r>
-              <w:rPr>
-                <w:rFonts w:ascii="Tahoma" w:eastAsia="Tahoma" w:hAnsi="Tahoma" w:cs="Tahoma"/>
-                <w:b/>
-              </w:rPr>
+            <w:r>
               <w:t>Penyajian</w:t>
             </w:r>
           </w:p>
@@ -1280,46 +915,9 @@
             <w:vAlign w:val="center"/>
           </w:tcPr>
           <w:p>
-            <w:pPr>
-              <w:jc w:val="center"/>
-              <w:rPr>
-                <w:rFonts w:ascii="Tahoma" w:eastAsia="Tahoma" w:hAnsi="Tahoma" w:cs="Tahoma"/>
-                <w:b/>
-                <w:sz w:val="22"/>
-                <w:szCs w:val="22"/>
-              </w:rPr>
-            </w:pPr>
-          </w:p>
-          <w:p>
-            <w:pPr>
-              <w:jc w:val="center"/>
-              <w:rPr>
-                <w:rFonts w:ascii="Tahoma" w:eastAsia="Tahoma" w:hAnsi="Tahoma" w:cs="Tahoma"/>
-                <w:b/>
-                <w:sz w:val="22"/>
-                <w:szCs w:val="22"/>
-              </w:rPr>
-            </w:pPr>
-            <w:r>
-              <w:rPr>
-                <w:rFonts w:ascii="Tahoma" w:eastAsia="Tahoma" w:hAnsi="Tahoma" w:cs="Tahoma"/>
-                <w:b/>
-                <w:sz w:val="22"/>
-                <w:szCs w:val="22"/>
-              </w:rPr>
+            <w:r>
               <w:t>Sub Judul</w:t>
             </w:r>
-          </w:p>
-          <w:p>
-            <w:pPr>
-              <w:jc w:val="center"/>
-              <w:rPr>
-                <w:rFonts w:ascii="Tahoma" w:eastAsia="Tahoma" w:hAnsi="Tahoma" w:cs="Tahoma"/>
-                <w:i/>
-                <w:sz w:val="22"/>
-                <w:szCs w:val="22"/>
-              </w:rPr>
-            </w:pPr>
           </w:p>
         </w:tc>
         <w:tc>
@@ -1329,46 +927,9 @@
             <w:vAlign w:val="center"/>
           </w:tcPr>
           <w:p>
-            <w:pPr>
-              <w:jc w:val="center"/>
-              <w:rPr>
-                <w:rFonts w:ascii="Tahoma" w:eastAsia="Tahoma" w:hAnsi="Tahoma" w:cs="Tahoma"/>
-                <w:b/>
-                <w:sz w:val="22"/>
-                <w:szCs w:val="22"/>
-              </w:rPr>
-            </w:pPr>
-          </w:p>
-          <w:p>
-            <w:pPr>
-              <w:jc w:val="center"/>
-              <w:rPr>
-                <w:rFonts w:ascii="Tahoma" w:eastAsia="Tahoma" w:hAnsi="Tahoma" w:cs="Tahoma"/>
-                <w:b/>
-                <w:sz w:val="22"/>
-                <w:szCs w:val="22"/>
-              </w:rPr>
-            </w:pPr>
-            <w:r>
-              <w:rPr>
-                <w:rFonts w:ascii="Tahoma" w:eastAsia="Tahoma" w:hAnsi="Tahoma" w:cs="Tahoma"/>
-                <w:b/>
-                <w:sz w:val="22"/>
-                <w:szCs w:val="22"/>
-              </w:rPr>
+            <w:r>
               <w:t>Uraian Kegiatan</w:t>
             </w:r>
-          </w:p>
-          <w:p>
-            <w:pPr>
-              <w:jc w:val="center"/>
-              <w:rPr>
-                <w:rFonts w:ascii="Tahoma" w:eastAsia="Tahoma" w:hAnsi="Tahoma" w:cs="Tahoma"/>
-                <w:i/>
-                <w:sz w:val="22"/>
-                <w:szCs w:val="22"/>
-              </w:rPr>
-            </w:pPr>
           </w:p>
         </w:tc>
         <w:tc>
@@ -1378,21 +939,7 @@
             <w:vAlign w:val="center"/>
           </w:tcPr>
           <w:p>
-            <w:pPr>
-              <w:jc w:val="center"/>
-              <w:rPr>
-                <w:rFonts w:ascii="Tahoma" w:eastAsia="Tahoma" w:hAnsi="Tahoma" w:cs="Tahoma"/>
-                <w:sz w:val="22"/>
-                <w:szCs w:val="22"/>
-              </w:rPr>
-            </w:pPr>
-            <w:r>
-              <w:rPr>
-                <w:rFonts w:ascii="Tahoma" w:eastAsia="Tahoma" w:hAnsi="Tahoma" w:cs="Tahoma"/>
-                <w:b/>
-                <w:sz w:val="22"/>
-                <w:szCs w:val="22"/>
-              </w:rPr>
+            <w:r>
               <w:t>Media Pembelajaran</w:t>
             </w:r>
           </w:p>
@@ -1403,32 +950,8 @@
             <w:vAlign w:val="center"/>
           </w:tcPr>
           <w:p>
-            <w:pPr>
-              <w:jc w:val="center"/>
-              <w:rPr>
-                <w:rFonts w:ascii="Tahoma" w:eastAsia="Tahoma" w:hAnsi="Tahoma" w:cs="Tahoma"/>
-                <w:i/>
-                <w:sz w:val="22"/>
-                <w:szCs w:val="22"/>
-              </w:rPr>
-            </w:pPr>
-            <w:r>
-              <w:rPr>
-                <w:rFonts w:ascii="Tahoma" w:eastAsia="Tahoma" w:hAnsi="Tahoma" w:cs="Tahoma"/>
-                <w:b/>
-                <w:sz w:val="22"/>
-                <w:szCs w:val="22"/>
-              </w:rPr>
+            <w:r>
               <w:t>Perkiraan Waktu</w:t>
-            </w:r>
-            <w:r>
-              <w:rPr>
-                <w:rFonts w:ascii="Tahoma" w:eastAsia="Tahoma" w:hAnsi="Tahoma" w:cs="Tahoma"/>
-                <w:i/>
-                <w:sz w:val="22"/>
-                <w:szCs w:val="22"/>
-              </w:rPr>
-              <w:t xml:space="preserve"> </w:t>
             </w:r>
           </w:p>
         </w:tc>
@@ -1446,7 +969,7 @@
           </w:tcPr>
           <w:p>
             <w:r>
-              <w:t>Konsep Dasar DKV &amp; Analisis Brief</w:t>
+              <w:t>Konsep Dasar Desain Grafis &amp; Komponen Design Brief</w:t>
             </w:r>
           </w:p>
         </w:tc>
@@ -1457,7 +980,15 @@
           </w:tcPr>
           <w:p>
             <w:r>
-              <w:t>Penjelasan ruang lingkup profesi Desainer Grafis Muda dan cara membedah komponen kunci dalam Design Brief.</w:t>
+              <w:t>Instruktur menjelaskan kepada peserta terkait:</w:t>
+              <w:br/>
+              <w:t>- Pengertian dan ruang lingkup industri Kreatif &amp; DKV</w:t>
+              <w:br/>
+              <w:t>- Profesi Desainer Grafis Muda di era digital</w:t>
+              <w:br/>
+              <w:t>- Anatomi Design Brief: Latar Belakang, Tujuan, Target Audiens, Batasan, dan Deliverables</w:t>
+              <w:br/>
+              <w:t>Instruktur menanyakan kepada peserta apakah materi telah dipahami dan membuka sesi tanya jawab.</w:t>
             </w:r>
           </w:p>
         </w:tc>
@@ -1467,23 +998,9 @@
             <w:gridSpan w:val="3"/>
           </w:tcPr>
           <w:p>
-            <w:pPr>
-              <w:pBdr>
-                <w:top w:val="nil"/>
-                <w:left w:val="nil"/>
-                <w:bottom w:val="nil"/>
-                <w:right w:val="nil"/>
-                <w:between w:val="nil"/>
-              </w:pBdr>
-              <w:spacing w:before="60" w:line="276" w:lineRule="auto"/>
-              <w:ind w:left="253" w:right="89"/>
-              <w:rPr>
-                <w:rFonts w:ascii="Tahoma" w:eastAsia="Tahoma" w:hAnsi="Tahoma" w:cs="Tahoma"/>
-                <w:color w:val="000000"/>
-                <w:sz w:val="22"/>
-                <w:szCs w:val="22"/>
-              </w:rPr>
-            </w:pPr>
+            <w:r>
+              <w:t>Power Point &amp; Sampel Brief</w:t>
+            </w:r>
           </w:p>
         </w:tc>
         <w:tc>
@@ -1491,15 +1008,9 @@
             <w:tcW w:w="1850" w:type="dxa"/>
           </w:tcPr>
           <w:p>
-            <w:pPr>
-              <w:spacing w:before="60"/>
-              <w:jc w:val="center"/>
-              <w:rPr>
-                <w:rFonts w:ascii="Tahoma" w:eastAsia="Tahoma" w:hAnsi="Tahoma" w:cs="Tahoma"/>
-                <w:sz w:val="22"/>
-                <w:szCs w:val="22"/>
-              </w:rPr>
-            </w:pPr>
+            <w:r>
+              <w:t>35 menit</w:t>
+            </w:r>
           </w:p>
         </w:tc>
       </w:tr>
@@ -1516,7 +1027,7 @@
           </w:tcPr>
           <w:p>
             <w:r>
-              <w:t>Demonstrasi Bedah Brief</w:t>
+              <w:t>Demonstrasi Bedah Brief &amp; Analisis Kasus</w:t>
             </w:r>
           </w:p>
         </w:tc>
@@ -1527,7 +1038,13 @@
           </w:tcPr>
           <w:p>
             <w:r>
-              <w:t>Praktik ekstraksi keyword dari brief sampel dan pemetaan target audiens.</w:t>
+              <w:t>Instruktur mendemonstrasikan kepada peserta terkait:</w:t>
+              <w:br/>
+              <w:t>- Cara membaca dan mengekstrak poin-poin penting dari dokumen brief klien</w:t>
+              <w:br/>
+              <w:t>- Teknik memetakan kebutuhan visual berdasarkan target audiens dan tone of voice</w:t>
+              <w:br/>
+              <w:t>- Tanya jawab interaktif bersama peserta.</w:t>
             </w:r>
           </w:p>
         </w:tc>
@@ -1537,23 +1054,9 @@
             <w:gridSpan w:val="3"/>
           </w:tcPr>
           <w:p>
-            <w:pPr>
-              <w:pBdr>
-                <w:top w:val="nil"/>
-                <w:left w:val="nil"/>
-                <w:bottom w:val="nil"/>
-                <w:right w:val="nil"/>
-                <w:between w:val="nil"/>
-              </w:pBdr>
-              <w:spacing w:before="60" w:line="276" w:lineRule="auto"/>
-              <w:ind w:left="253" w:right="89"/>
-              <w:rPr>
-                <w:rFonts w:ascii="Tahoma" w:eastAsia="Tahoma" w:hAnsi="Tahoma" w:cs="Tahoma"/>
-                <w:color w:val="000000"/>
-                <w:sz w:val="22"/>
-                <w:szCs w:val="22"/>
-              </w:rPr>
-            </w:pPr>
+            <w:r>
+              <w:t>Power Point &amp; Screen Projector</w:t>
+            </w:r>
           </w:p>
         </w:tc>
         <w:tc>
@@ -1561,15 +1064,9 @@
             <w:tcW w:w="1850" w:type="dxa"/>
           </w:tcPr>
           <w:p>
-            <w:pPr>
-              <w:spacing w:before="60"/>
-              <w:jc w:val="center"/>
-              <w:rPr>
-                <w:rFonts w:ascii="Tahoma" w:eastAsia="Tahoma" w:hAnsi="Tahoma" w:cs="Tahoma"/>
-                <w:sz w:val="22"/>
-                <w:szCs w:val="22"/>
-              </w:rPr>
-            </w:pPr>
+            <w:r>
+              <w:t>35 menit</w:t>
+            </w:r>
           </w:p>
         </w:tc>
       </w:tr>
@@ -1586,7 +1083,7 @@
           </w:tcPr>
           <w:p>
             <w:r>
-              <w:t>Praktik Analisis Brief</w:t>
+              <w:t>Praktik Mandiri: Analisis Lembar Kerja Brief</w:t>
             </w:r>
           </w:p>
         </w:tc>
@@ -1597,7 +1094,13 @@
           </w:tcPr>
           <w:p>
             <w:r>
-              <w:t>Peserta menganalisis sampel brief riil dan menentukan output yang diminta klien.</w:t>
+              <w:t>Instruktur memberikan jobsheet dan mendampingi peserta untuk:</w:t>
+              <w:br/>
+              <w:t>- Menganalisis 1 studi kasus design brief yang dibagikan</w:t>
+              <w:br/>
+              <w:t>- Mengisi lembar kerja analisis (tujuan, audiens, format file output)</w:t>
+              <w:br/>
+              <w:t>- Instruktur berkeliling memberikan bimbingan dan umpan balik personal kepada setiap peserta.</w:t>
             </w:r>
           </w:p>
         </w:tc>
@@ -1607,23 +1110,9 @@
             <w:gridSpan w:val="3"/>
           </w:tcPr>
           <w:p>
-            <w:pPr>
-              <w:pBdr>
-                <w:top w:val="nil"/>
-                <w:left w:val="nil"/>
-                <w:bottom w:val="nil"/>
-                <w:right w:val="nil"/>
-                <w:between w:val="nil"/>
-              </w:pBdr>
-              <w:spacing w:before="60" w:line="276" w:lineRule="auto"/>
-              <w:ind w:left="253" w:right="89"/>
-              <w:rPr>
-                <w:rFonts w:ascii="Tahoma" w:eastAsia="Tahoma" w:hAnsi="Tahoma" w:cs="Tahoma"/>
-                <w:color w:val="000000"/>
-                <w:sz w:val="22"/>
-                <w:szCs w:val="22"/>
-              </w:rPr>
-            </w:pPr>
+            <w:r>
+              <w:t>PC Lab &amp; Lembar Jobsheet 01</w:t>
+            </w:r>
           </w:p>
         </w:tc>
         <w:tc>
@@ -1631,15 +1120,9 @@
             <w:tcW w:w="1850" w:type="dxa"/>
           </w:tcPr>
           <w:p>
-            <w:pPr>
-              <w:spacing w:before="60"/>
-              <w:jc w:val="center"/>
-              <w:rPr>
-                <w:rFonts w:ascii="Tahoma" w:eastAsia="Tahoma" w:hAnsi="Tahoma" w:cs="Tahoma"/>
-                <w:sz w:val="22"/>
-                <w:szCs w:val="22"/>
-              </w:rPr>
-            </w:pPr>
+            <w:r>
+              <w:t>35 menit</w:t>
+            </w:r>
           </w:p>
         </w:tc>
       </w:tr>
@@ -1655,24 +1138,7 @@
             <w:gridSpan w:val="3"/>
           </w:tcPr>
           <w:p>
-            <w:pPr>
-              <w:pStyle w:val="ListParagraph"/>
-              <w:numPr>
-                <w:ilvl w:val="3"/>
-                <w:numId w:val="5"/>
-              </w:numPr>
-              <w:spacing w:before="60"/>
-              <w:ind w:left="292"/>
-              <w:rPr>
-                <w:rFonts w:ascii="Tahoma" w:eastAsia="Tahoma" w:hAnsi="Tahoma" w:cs="Tahoma"/>
-                <w:b/>
-              </w:rPr>
-            </w:pPr>
-            <w:r>
-              <w:rPr>
-                <w:rFonts w:ascii="Tahoma" w:eastAsia="Tahoma" w:hAnsi="Tahoma" w:cs="Tahoma"/>
-                <w:b/>
-              </w:rPr>
+            <w:r>
               <w:t>Kesimpulan ( Summary)</w:t>
             </w:r>
           </w:p>
@@ -1684,7 +1150,7 @@
           </w:tcPr>
           <w:p>
             <w:r>
-              <w:t>Pentingnya fondasi brief sebelum eksekusi.</w:t>
+              <w:t>Instruktur menyimpulkan bahwa pemahaman yang mendalam terhadap Design Brief adalah kunci utama agar proses perancangan desain tidak salah arah dan sesuai dengan ekspektasi.</w:t>
             </w:r>
           </w:p>
         </w:tc>
@@ -1694,23 +1160,9 @@
             <w:gridSpan w:val="3"/>
           </w:tcPr>
           <w:p>
-            <w:pPr>
-              <w:pBdr>
-                <w:top w:val="nil"/>
-                <w:left w:val="nil"/>
-                <w:bottom w:val="nil"/>
-                <w:right w:val="nil"/>
-                <w:between w:val="nil"/>
-              </w:pBdr>
-              <w:spacing w:before="60" w:line="276" w:lineRule="auto"/>
-              <w:ind w:left="253" w:right="89"/>
-              <w:rPr>
-                <w:rFonts w:ascii="Tahoma" w:eastAsia="Tahoma" w:hAnsi="Tahoma" w:cs="Tahoma"/>
-                <w:color w:val="000000"/>
-                <w:sz w:val="22"/>
-                <w:szCs w:val="22"/>
-              </w:rPr>
-            </w:pPr>
+            <w:r>
+              <w:t>Power Point</w:t>
+            </w:r>
           </w:p>
         </w:tc>
         <w:tc>
@@ -1718,15 +1170,9 @@
             <w:tcW w:w="1850" w:type="dxa"/>
           </w:tcPr>
           <w:p>
-            <w:pPr>
-              <w:spacing w:before="60"/>
-              <w:jc w:val="center"/>
-              <w:rPr>
-                <w:rFonts w:ascii="Tahoma" w:eastAsia="Tahoma" w:hAnsi="Tahoma" w:cs="Tahoma"/>
-                <w:sz w:val="22"/>
-                <w:szCs w:val="22"/>
-              </w:rPr>
-            </w:pPr>
+            <w:r>
+              <w:t>5 menit</w:t>
+            </w:r>
           </w:p>
         </w:tc>
       </w:tr>
@@ -1743,25 +1189,7 @@
             <w:vAlign w:val="center"/>
           </w:tcPr>
           <w:p>
-            <w:pPr>
-              <w:pStyle w:val="ListParagraph"/>
-              <w:numPr>
-                <w:ilvl w:val="0"/>
-                <w:numId w:val="6"/>
-              </w:numPr>
-              <w:spacing w:before="120" w:after="120"/>
-              <w:ind w:left="436" w:hanging="426"/>
-              <w:jc w:val="both"/>
-              <w:rPr>
-                <w:rFonts w:ascii="Tahoma" w:eastAsia="Tahoma" w:hAnsi="Tahoma" w:cs="Tahoma"/>
-                <w:b/>
-              </w:rPr>
-            </w:pPr>
-            <w:r>
-              <w:rPr>
-                <w:rFonts w:ascii="Tahoma" w:eastAsia="Tahoma" w:hAnsi="Tahoma" w:cs="Tahoma"/>
-                <w:b/>
-              </w:rPr>
+            <w:r>
               <w:t>Aplikasi</w:t>
             </w:r>
           </w:p>
@@ -1773,7 +1201,161 @@
           </w:tcPr>
           <w:p>
             <w:r>
-              <w:t>Kuis komponen brief.</w:t>
+              <w:t>Instruktur memberikan pertanyaan kuis interaktif menggunakan Quizizz untuk menguji pemahaman peserta mengenai komponen Design Brief.</w:t>
+            </w:r>
+          </w:p>
+        </w:tc>
+        <w:tc>
+          <w:tcPr>
+            <w:tcW w:w="1796" w:type="dxa"/>
+            <w:gridSpan w:val="3"/>
+          </w:tcPr>
+          <w:p>
+            <w:r>
+              <w:t>Quizizz.com / Form</w:t>
+            </w:r>
+          </w:p>
+        </w:tc>
+        <w:tc>
+          <w:tcPr>
+            <w:tcW w:w="1850" w:type="dxa"/>
+          </w:tcPr>
+          <w:p>
+            <w:r>
+              <w:t>20 menit</w:t>
+            </w:r>
+          </w:p>
+        </w:tc>
+      </w:tr>
+      <w:tr>
+        <w:trPr>
+          <w:gridAfter w:val="1"/>
+          <w:wAfter w:w="10" w:type="dxa"/>
+          <w:trHeight w:val="306"/>
+        </w:trPr>
+        <w:tc>
+          <w:tcPr>
+            <w:tcW w:w="2665" w:type="dxa"/>
+            <w:gridSpan w:val="3"/>
+            <w:vAlign w:val="center"/>
+          </w:tcPr>
+          <w:p>
+            <w:r>
+              <w:t>Evaluasi</w:t>
+            </w:r>
+          </w:p>
+        </w:tc>
+        <w:tc>
+          <w:tcPr>
+            <w:tcW w:w="3543" w:type="dxa"/>
+            <w:gridSpan w:val="2"/>
+          </w:tcPr>
+          <w:p>
+            <w:r>
+              <w:t>Instruktur membagikan lembar jobsheet 01 kepada peserta untuk dinilai pemahamannya.</w:t>
+            </w:r>
+          </w:p>
+        </w:tc>
+        <w:tc>
+          <w:tcPr>
+            <w:tcW w:w="1796" w:type="dxa"/>
+            <w:gridSpan w:val="3"/>
+          </w:tcPr>
+          <w:p>
+            <w:r>
+              <w:t>Lembar Jobsheet 01 &amp; Rubrik</w:t>
+            </w:r>
+          </w:p>
+        </w:tc>
+        <w:tc>
+          <w:tcPr>
+            <w:tcW w:w="1850" w:type="dxa"/>
+          </w:tcPr>
+          <w:p>
+            <w:r>
+              <w:t>30 menit</w:t>
+            </w:r>
+          </w:p>
+        </w:tc>
+      </w:tr>
+      <w:tr>
+        <w:trPr>
+          <w:gridAfter w:val="1"/>
+          <w:wAfter w:w="10" w:type="dxa"/>
+          <w:trHeight w:val="587"/>
+        </w:trPr>
+        <w:tc>
+          <w:tcPr>
+            <w:tcW w:w="2665" w:type="dxa"/>
+            <w:gridSpan w:val="3"/>
+            <w:vAlign w:val="center"/>
+          </w:tcPr>
+          <w:p>
+            <w:r>
+              <w:t>Tugas Tambahan</w:t>
+            </w:r>
+          </w:p>
+        </w:tc>
+        <w:tc>
+          <w:tcPr>
+            <w:tcW w:w="3543" w:type="dxa"/>
+            <w:gridSpan w:val="2"/>
+          </w:tcPr>
+          <w:p>
+            <w:r>
+              <w:t>Instruktur memberikan tugas tambahan: Mencari 2 contoh iklan media sosial dan menganalisis target audiens sasarannya untuk dikumpulkan besok.</w:t>
+            </w:r>
+          </w:p>
+        </w:tc>
+        <w:tc>
+          <w:tcPr>
+            <w:tcW w:w="1796" w:type="dxa"/>
+            <w:gridSpan w:val="3"/>
+          </w:tcPr>
+          <w:p>
+            <w:r>
+              <w:t>Instruktur memberikan tugas tambahan: Mencari 2 contoh iklan media sosial dan menganalisis target audiens sasarannya untuk dikumpulkan besok.</w:t>
+            </w:r>
+          </w:p>
+        </w:tc>
+        <w:tc>
+          <w:tcPr>
+            <w:tcW w:w="1850" w:type="dxa"/>
+          </w:tcPr>
+          <w:p>
+            <w:r>
+              <w:t>5 menit</w:t>
+            </w:r>
+          </w:p>
+        </w:tc>
+      </w:tr>
+      <w:tr>
+        <w:trPr>
+          <w:gridAfter w:val="1"/>
+          <w:wAfter w:w="10" w:type="dxa"/>
+        </w:trPr>
+        <w:tc>
+          <w:tcPr>
+            <w:tcW w:w="2665" w:type="dxa"/>
+            <w:gridSpan w:val="3"/>
+            <w:vAlign w:val="center"/>
+          </w:tcPr>
+          <w:p>
+            <w:r>
+              <w:t>Pemberesan Kelas</w:t>
+            </w:r>
+          </w:p>
+        </w:tc>
+        <w:tc>
+          <w:tcPr>
+            <w:tcW w:w="3543" w:type="dxa"/>
+            <w:gridSpan w:val="2"/>
+          </w:tcPr>
+          <w:p>
+            <w:r>
+              <w:t>Merapikan perangkat PC dan ruang lab (5R)</w:t>
+              <w:br/>
+              <w:t>Berdoa dan memberikan salam penutup</w:t>
             </w:r>
           </w:p>
         </w:tc>
@@ -1811,349 +1393,9 @@
             <w:tcW w:w="1850" w:type="dxa"/>
           </w:tcPr>
           <w:p>
-            <w:pPr>
-              <w:pBdr>
-                <w:top w:val="nil"/>
-                <w:left w:val="nil"/>
-                <w:bottom w:val="nil"/>
-                <w:right w:val="nil"/>
-                <w:between w:val="nil"/>
-              </w:pBdr>
-              <w:spacing w:before="60"/>
-              <w:jc w:val="center"/>
-              <w:rPr>
-                <w:rFonts w:ascii="Tahoma" w:eastAsia="Tahoma" w:hAnsi="Tahoma" w:cs="Tahoma"/>
-                <w:sz w:val="22"/>
-                <w:szCs w:val="22"/>
-              </w:rPr>
-            </w:pPr>
-          </w:p>
-        </w:tc>
-      </w:tr>
-      <w:tr>
-        <w:trPr>
-          <w:gridAfter w:val="1"/>
-          <w:wAfter w:w="10" w:type="dxa"/>
-          <w:trHeight w:val="306"/>
-        </w:trPr>
-        <w:tc>
-          <w:tcPr>
-            <w:tcW w:w="2665" w:type="dxa"/>
-            <w:gridSpan w:val="3"/>
-            <w:vAlign w:val="center"/>
-          </w:tcPr>
-          <w:p>
-            <w:pPr>
-              <w:pStyle w:val="ListParagraph"/>
-              <w:numPr>
-                <w:ilvl w:val="0"/>
-                <w:numId w:val="6"/>
-              </w:numPr>
-              <w:spacing w:before="120" w:after="120"/>
-              <w:ind w:left="436" w:hanging="426"/>
-              <w:jc w:val="both"/>
-              <w:rPr>
-                <w:rFonts w:ascii="Tahoma" w:eastAsia="Tahoma" w:hAnsi="Tahoma" w:cs="Tahoma"/>
-                <w:b/>
-              </w:rPr>
-            </w:pPr>
-            <w:r>
-              <w:rPr>
-                <w:rFonts w:ascii="Tahoma" w:eastAsia="Tahoma" w:hAnsi="Tahoma" w:cs="Tahoma"/>
-                <w:b/>
-              </w:rPr>
-              <w:t>Evaluasi</w:t>
-            </w:r>
-          </w:p>
-        </w:tc>
-        <w:tc>
-          <w:tcPr>
-            <w:tcW w:w="3543" w:type="dxa"/>
-            <w:gridSpan w:val="2"/>
-          </w:tcPr>
-          <w:p>
-            <w:r>
-              <w:t>Jobsheet 01: Analisis Brief.</w:t>
-            </w:r>
-          </w:p>
-        </w:tc>
-        <w:tc>
-          <w:tcPr>
-            <w:tcW w:w="1796" w:type="dxa"/>
-            <w:gridSpan w:val="3"/>
-          </w:tcPr>
-          <w:p>
-            <w:pPr>
-              <w:numPr>
-                <w:ilvl w:val="0"/>
-                <w:numId w:val="4"/>
-              </w:numPr>
-              <w:pBdr>
-                <w:top w:val="nil"/>
-                <w:left w:val="nil"/>
-                <w:bottom w:val="nil"/>
-                <w:right w:val="nil"/>
-                <w:between w:val="nil"/>
-              </w:pBdr>
-              <w:spacing w:before="60" w:line="276" w:lineRule="auto"/>
-              <w:ind w:left="253" w:right="89" w:hanging="220"/>
-              <w:rPr>
-                <w:rFonts w:ascii="Tahoma" w:eastAsia="Tahoma" w:hAnsi="Tahoma" w:cs="Tahoma"/>
-                <w:color w:val="000000"/>
-                <w:sz w:val="22"/>
-                <w:szCs w:val="22"/>
-              </w:rPr>
-            </w:pPr>
-          </w:p>
-        </w:tc>
-        <w:tc>
-          <w:tcPr>
-            <w:tcW w:w="1850" w:type="dxa"/>
-          </w:tcPr>
-          <w:p>
-            <w:pPr>
-              <w:pBdr>
-                <w:top w:val="nil"/>
-                <w:left w:val="nil"/>
-                <w:bottom w:val="nil"/>
-                <w:right w:val="nil"/>
-                <w:between w:val="nil"/>
-              </w:pBdr>
-              <w:spacing w:before="60"/>
-              <w:jc w:val="center"/>
-              <w:rPr>
-                <w:rFonts w:ascii="Tahoma" w:eastAsia="Tahoma" w:hAnsi="Tahoma" w:cs="Tahoma"/>
-                <w:sz w:val="22"/>
-                <w:szCs w:val="22"/>
-              </w:rPr>
-            </w:pPr>
-          </w:p>
-        </w:tc>
-      </w:tr>
-      <w:tr>
-        <w:trPr>
-          <w:gridAfter w:val="1"/>
-          <w:wAfter w:w="10" w:type="dxa"/>
-          <w:trHeight w:val="587"/>
-        </w:trPr>
-        <w:tc>
-          <w:tcPr>
-            <w:tcW w:w="2665" w:type="dxa"/>
-            <w:gridSpan w:val="3"/>
-            <w:vAlign w:val="center"/>
-          </w:tcPr>
-          <w:p>
-            <w:pPr>
-              <w:spacing w:before="120" w:after="120"/>
-              <w:jc w:val="both"/>
-              <w:rPr>
-                <w:rFonts w:ascii="Tahoma" w:eastAsia="Tahoma" w:hAnsi="Tahoma" w:cs="Tahoma"/>
-                <w:b/>
-                <w:sz w:val="22"/>
-                <w:szCs w:val="22"/>
-              </w:rPr>
-            </w:pPr>
-            <w:r>
-              <w:rPr>
-                <w:rFonts w:ascii="Tahoma" w:eastAsia="Tahoma" w:hAnsi="Tahoma" w:cs="Tahoma"/>
-                <w:b/>
-                <w:sz w:val="22"/>
-                <w:szCs w:val="22"/>
-              </w:rPr>
-              <w:t>Tugas Tambahan</w:t>
-            </w:r>
-          </w:p>
-        </w:tc>
-        <w:tc>
-          <w:tcPr>
-            <w:tcW w:w="3543" w:type="dxa"/>
-            <w:gridSpan w:val="2"/>
-          </w:tcPr>
-          <w:p>
-            <w:pPr>
-              <w:numPr>
-                <w:ilvl w:val="0"/>
-                <w:numId w:val="4"/>
-              </w:numPr>
-              <w:pBdr>
-                <w:top w:val="nil"/>
-                <w:left w:val="nil"/>
-                <w:bottom w:val="nil"/>
-                <w:right w:val="nil"/>
-                <w:between w:val="nil"/>
-              </w:pBdr>
-              <w:spacing w:before="60" w:line="276" w:lineRule="auto"/>
-              <w:ind w:left="253" w:right="89" w:hanging="220"/>
-              <w:rPr>
-                <w:rFonts w:ascii="Tahoma" w:eastAsia="Tahoma" w:hAnsi="Tahoma" w:cs="Tahoma"/>
-                <w:color w:val="000000"/>
-                <w:sz w:val="22"/>
-                <w:szCs w:val="22"/>
-              </w:rPr>
-            </w:pPr>
-          </w:p>
-        </w:tc>
-        <w:tc>
-          <w:tcPr>
-            <w:tcW w:w="1796" w:type="dxa"/>
-            <w:gridSpan w:val="3"/>
-          </w:tcPr>
-          <w:p>
-            <w:pPr>
-              <w:pBdr>
-                <w:top w:val="nil"/>
-                <w:left w:val="nil"/>
-                <w:bottom w:val="nil"/>
-                <w:right w:val="nil"/>
-                <w:between w:val="nil"/>
-              </w:pBdr>
-              <w:spacing w:before="60" w:line="276" w:lineRule="auto"/>
-              <w:ind w:left="33" w:right="89"/>
-              <w:rPr>
-                <w:rFonts w:ascii="Tahoma" w:eastAsia="Tahoma" w:hAnsi="Tahoma" w:cs="Tahoma"/>
-                <w:color w:val="000000"/>
-                <w:sz w:val="22"/>
-                <w:szCs w:val="22"/>
-              </w:rPr>
-            </w:pPr>
-          </w:p>
-        </w:tc>
-        <w:tc>
-          <w:tcPr>
-            <w:tcW w:w="1850" w:type="dxa"/>
-          </w:tcPr>
-          <w:p>
-            <w:pPr>
-              <w:pBdr>
-                <w:top w:val="nil"/>
-                <w:left w:val="nil"/>
-                <w:bottom w:val="nil"/>
-                <w:right w:val="nil"/>
-                <w:between w:val="nil"/>
-              </w:pBdr>
-              <w:spacing w:before="60"/>
-              <w:jc w:val="center"/>
-              <w:rPr>
-                <w:rFonts w:ascii="Tahoma" w:eastAsia="Tahoma" w:hAnsi="Tahoma" w:cs="Tahoma"/>
-                <w:sz w:val="22"/>
-                <w:szCs w:val="22"/>
-              </w:rPr>
-            </w:pPr>
-          </w:p>
-        </w:tc>
-      </w:tr>
-      <w:tr>
-        <w:trPr>
-          <w:gridAfter w:val="1"/>
-          <w:wAfter w:w="10" w:type="dxa"/>
-        </w:trPr>
-        <w:tc>
-          <w:tcPr>
-            <w:tcW w:w="2665" w:type="dxa"/>
-            <w:gridSpan w:val="3"/>
-            <w:vAlign w:val="center"/>
-          </w:tcPr>
-          <w:p>
-            <w:pPr>
-              <w:spacing w:before="120" w:after="120"/>
-              <w:jc w:val="both"/>
-              <w:rPr>
-                <w:rFonts w:ascii="Tahoma" w:eastAsia="Tahoma" w:hAnsi="Tahoma" w:cs="Tahoma"/>
-                <w:b/>
-                <w:sz w:val="22"/>
-                <w:szCs w:val="22"/>
-              </w:rPr>
-            </w:pPr>
-            <w:r>
-              <w:rPr>
-                <w:rFonts w:ascii="Tahoma" w:eastAsia="Tahoma" w:hAnsi="Tahoma" w:cs="Tahoma"/>
-                <w:b/>
-                <w:sz w:val="22"/>
-                <w:szCs w:val="22"/>
-              </w:rPr>
-              <w:t>Pemberesan Kelas</w:t>
-            </w:r>
-          </w:p>
-        </w:tc>
-        <w:tc>
-          <w:tcPr>
-            <w:tcW w:w="3543" w:type="dxa"/>
-            <w:gridSpan w:val="2"/>
-          </w:tcPr>
-          <w:p>
-            <w:pPr>
-              <w:numPr>
-                <w:ilvl w:val="0"/>
-                <w:numId w:val="4"/>
-              </w:numPr>
-              <w:pBdr>
-                <w:top w:val="nil"/>
-                <w:left w:val="nil"/>
-                <w:bottom w:val="nil"/>
-                <w:right w:val="nil"/>
-                <w:between w:val="nil"/>
-              </w:pBdr>
-              <w:spacing w:before="60" w:line="276" w:lineRule="auto"/>
-              <w:ind w:left="253" w:right="89" w:hanging="220"/>
-              <w:rPr>
-                <w:rFonts w:ascii="Tahoma" w:eastAsia="Tahoma" w:hAnsi="Tahoma" w:cs="Tahoma"/>
-                <w:color w:val="000000"/>
-                <w:sz w:val="22"/>
-                <w:szCs w:val="22"/>
-              </w:rPr>
-            </w:pPr>
-          </w:p>
-        </w:tc>
-        <w:tc>
-          <w:tcPr>
-            <w:tcW w:w="1796" w:type="dxa"/>
-            <w:gridSpan w:val="3"/>
-          </w:tcPr>
-          <w:p>
-            <w:pPr>
-              <w:numPr>
-                <w:ilvl w:val="0"/>
-                <w:numId w:val="4"/>
-              </w:numPr>
-              <w:pBdr>
-                <w:top w:val="nil"/>
-                <w:left w:val="nil"/>
-                <w:bottom w:val="nil"/>
-                <w:right w:val="nil"/>
-                <w:between w:val="nil"/>
-              </w:pBdr>
-              <w:spacing w:before="60" w:line="276" w:lineRule="auto"/>
-              <w:ind w:left="253" w:right="89" w:hanging="220"/>
-              <w:rPr>
-                <w:rFonts w:ascii="Tahoma" w:eastAsia="Tahoma" w:hAnsi="Tahoma" w:cs="Tahoma"/>
-                <w:color w:val="000000"/>
-                <w:sz w:val="22"/>
-                <w:szCs w:val="22"/>
-              </w:rPr>
-            </w:pPr>
-          </w:p>
-        </w:tc>
-        <w:tc>
-          <w:tcPr>
-            <w:tcW w:w="1850" w:type="dxa"/>
-          </w:tcPr>
-          <w:p>
-            <w:pPr>
-              <w:pBdr>
-                <w:top w:val="nil"/>
-                <w:left w:val="nil"/>
-                <w:bottom w:val="nil"/>
-                <w:right w:val="nil"/>
-                <w:between w:val="nil"/>
-              </w:pBdr>
-              <w:spacing w:before="60"/>
-              <w:jc w:val="center"/>
-              <w:rPr>
-                <w:rFonts w:ascii="Tahoma" w:eastAsia="Tahoma" w:hAnsi="Tahoma" w:cs="Tahoma"/>
-                <w:sz w:val="22"/>
-                <w:szCs w:val="22"/>
-              </w:rPr>
-            </w:pPr>
+            <w:r>
+              <w:t>5 menit</w:t>
+            </w:r>
           </w:p>
         </w:tc>
       </w:tr>

</xml_diff>